<commit_message>
Legal texts and help chat: connected tools, the API, and corrected facts
The privacy policy, DPA and terms now cover the tools a company connects
(its ATS, Slack, its systems through the API and web hooks), their data and
retention, API-key duties, and no automatic rejection through them. The
DPA allows anonymous quality statistics. Retention counts from the last
send. The referral reward pays on a first top-up of any amount. The help
chat names the fixed top-ups, all three sign-ins and the real footer. The
instructions and DPIA say a sample of keys is checked before release.

Co-Authored-By: Claude Opus 5.5 <noreply@anthropic.com>
</commit_message>
<xml_diff>
--- a/frontend/public/documents/prepza-dpia-template.docx
+++ b/frontend/public/documents/prepza-dpia-template.docx
@@ -16,7 +16,7 @@
         <w:pStyle w:val="FirstParagraph"/>
       </w:pPr>
       <w:r>
-        <w:t xml:space="preserve">Version: 2026-10-06</w:t>
+        <w:t xml:space="preserve">Version: 2026-10-08</w:t>
       </w:r>
       <w:r>
         <w:br/>
@@ -848,6 +848,75 @@
     <w:p>
       <w:pPr>
         <w:pStyle w:val="FirstParagraph"/>
+      </w:pPr>
+      <w:r>
+        <w:rPr>
+          <w:b/>
+          <w:bCs/>
+        </w:rPr>
+        <w:t xml:space="preserve">Tools you connect</w:t>
+      </w:r>
+      <w:r>
+        <w:t xml:space="preserve"> </w:t>
+      </w:r>
+      <w:r>
+        <w:t xml:space="preserve">(your own recipients, not prepza’s sub-processors; delete the ones you don’t</w:t>
+      </w:r>
+      <w:r>
+        <w:t xml:space="preserve"> </w:t>
+      </w:r>
+      <w:r>
+        <w:t xml:space="preserve">use):</w:t>
+      </w:r>
+      <w:r>
+        <w:t xml:space="preserve"> </w:t>
+      </w:r>
+      <w:r>
+        <w:rPr>
+          <w:b/>
+          <w:bCs/>
+        </w:rPr>
+        <w:t xml:space="preserve">[COMPANY: your applicant tracking system (Workable, Greenhouse, Teamtailor, Recruitee or</w:t>
+      </w:r>
+      <w:r>
+        <w:rPr>
+          <w:b/>
+          <w:bCs/>
+        </w:rPr>
+        <w:t xml:space="preserve"> </w:t>
+      </w:r>
+      <w:r>
+        <w:rPr>
+          <w:b/>
+          <w:bCs/>
+        </w:rPr>
+        <w:t xml:space="preserve">Breezy HR), your Slack workspace, your own systems through prepza’s API and web hooks]</w:t>
+      </w:r>
+      <w:r>
+        <w:t xml:space="preserve">. They</w:t>
+      </w:r>
+      <w:r>
+        <w:t xml:space="preserve"> </w:t>
+      </w:r>
+      <w:r>
+        <w:t xml:space="preserve">receive candidates’ emails, grades, whether the grade reached the passing grade, integrity signals</w:t>
+      </w:r>
+      <w:r>
+        <w:t xml:space="preserve"> </w:t>
+      </w:r>
+      <w:r>
+        <w:t xml:space="preserve">and a link to the results; your applicant tracking system also sends prepza the email and id of</w:t>
+      </w:r>
+      <w:r>
+        <w:t xml:space="preserve"> </w:t>
+      </w:r>
+      <w:r>
+        <w:t xml:space="preserve">each candidate you move to a linked stage, kept 12 months.</w:t>
+      </w:r>
+    </w:p>
+    <w:p>
+      <w:pPr>
+        <w:pStyle w:val="BodyText"/>
       </w:pPr>
       <w:r>
         <w:rPr>
@@ -1447,7 +1516,7 @@
               <w:pStyle w:val="Compact"/>
             </w:pPr>
             <w:r>
-              <w:t xml:space="preserve">Your topic review and trial run; answer keys checked before release; statistics and reports flag questions for a fix, and corrected keys re-mark past answers</w:t>
+              <w:t xml:space="preserve">Your topic review and trial run; a sample of answer keys per topic checked before release; statistics and reports flag questions for a fix, and corrected keys re-mark past answers</w:t>
             </w:r>
           </w:p>
         </w:tc>

</xml_diff>

<commit_message>
DPIA template: the assistant and AI apps (what OpenAI and the apps receive, retention, the risks and the company's decision about them); it no longer says OpenAI never gets candidates' data
Co-Authored-By: Claude Opus 5.5 <noreply@anthropic.com>
</commit_message>
<xml_diff>
--- a/frontend/public/documents/prepza-dpia-template.docx
+++ b/frontend/public/documents/prepza-dpia-template.docx
@@ -16,7 +16,7 @@
         <w:pStyle w:val="FirstParagraph"/>
       </w:pPr>
       <w:r>
-        <w:t xml:space="preserve">Version: 2026-10-08</w:t>
+        <w:t xml:space="preserve">Version: 2026-10-10</w:t>
       </w:r>
       <w:r>
         <w:br/>
@@ -473,6 +473,42 @@
     </w:p>
     <w:p>
       <w:pPr>
+        <w:pStyle w:val="Compact"/>
+        <w:numPr>
+          <w:ilvl w:val="0"/>
+          <w:numId w:val="1001"/>
+        </w:numPr>
+      </w:pPr>
+      <w:r>
+        <w:t xml:space="preserve">Your team can ask prepza’s assistant about interviews, candidates and results, in the app or</w:t>
+      </w:r>
+      <w:r>
+        <w:t xml:space="preserve"> </w:t>
+      </w:r>
+      <w:r>
+        <w:t xml:space="preserve">through an AI app a member connects to their own prepza account (such as Claude or ChatGPT).</w:t>
+      </w:r>
+      <w:r>
+        <w:t xml:space="preserve"> </w:t>
+      </w:r>
+      <w:r>
+        <w:t xml:space="preserve">It reads with that member’s access and role, can summarise and compare candidates, and can</w:t>
+      </w:r>
+      <w:r>
+        <w:t xml:space="preserve"> </w:t>
+      </w:r>
+      <w:r>
+        <w:t xml:space="preserve">act for them (inviting, changing a pass mark, revoking): in the app each action waits for their</w:t>
+      </w:r>
+      <w:r>
+        <w:t xml:space="preserve"> </w:t>
+      </w:r>
+      <w:r>
+        <w:t xml:space="preserve">confirmation; through an AI app, whether to ask first is up to that app.</w:t>
+      </w:r>
+    </w:p>
+    <w:p>
+      <w:pPr>
         <w:pStyle w:val="FirstParagraph"/>
       </w:pPr>
       <w:r>
@@ -812,13 +848,31 @@
         <w:t xml:space="preserve"> </w:t>
       </w:r>
       <w:r>
-        <w:t xml:space="preserve">picked each option, and the reasons questions were reported, never reporters’ comments,</w:t>
-      </w:r>
-      <w:r>
-        <w:t xml:space="preserve"> </w:t>
-      </w:r>
-      <w:r>
-        <w:t xml:space="preserve">candidates’ emails or individual answers).</w:t>
+        <w:t xml:space="preserve">picked each option, and the reasons questions were reported, never reporters’ comments. The</w:t>
+      </w:r>
+      <w:r>
+        <w:t xml:space="preserve"> </w:t>
+      </w:r>
+      <w:r>
+        <w:t xml:space="preserve">assistant’s answers: the member’s questions and the data its tools read with their access,</w:t>
+      </w:r>
+      <w:r>
+        <w:t xml:space="preserve"> </w:t>
+      </w:r>
+      <w:r>
+        <w:t xml:space="preserve">which can include candidates’ emails, names, grades and integrity signals; voice messages</w:t>
+      </w:r>
+      <w:r>
+        <w:t xml:space="preserve"> </w:t>
+      </w:r>
+      <w:r>
+        <w:t xml:space="preserve">turned into text. prepza tells OpenAI not to store it; under OpenAI’s API terms it keeps the</w:t>
+      </w:r>
+      <w:r>
+        <w:t xml:space="preserve"> </w:t>
+      </w:r>
+      <w:r>
+        <w:t xml:space="preserve">data for at most 30 days, only to check for abuse, and uses none of it for training).</w:t>
       </w:r>
     </w:p>
     <w:p>
@@ -947,6 +1001,64 @@
           <w:b/>
           <w:bCs/>
         </w:rPr>
+        <w:t xml:space="preserve">AI apps your members connect</w:t>
+      </w:r>
+      <w:r>
+        <w:t xml:space="preserve"> </w:t>
+      </w:r>
+      <w:r>
+        <w:t xml:space="preserve">(the member’s own recipients, not prepza’s sub-processors):</w:t>
+      </w:r>
+      <w:r>
+        <w:t xml:space="preserve"> </w:t>
+      </w:r>
+      <w:r>
+        <w:t xml:space="preserve">an app such as Claude (Anthropic) or ChatGPT (OpenAI) that a member connects to their prepza</w:t>
+      </w:r>
+      <w:r>
+        <w:t xml:space="preserve"> </w:t>
+      </w:r>
+      <w:r>
+        <w:t xml:space="preserve">account receives what that member asks it to read, within their role, including candidates’</w:t>
+      </w:r>
+      <w:r>
+        <w:t xml:space="preserve"> </w:t>
+      </w:r>
+      <w:r>
+        <w:t xml:space="preserve">data, under the app provider’s own terms.</w:t>
+      </w:r>
+      <w:r>
+        <w:t xml:space="preserve"> </w:t>
+      </w:r>
+      <w:r>
+        <w:rPr>
+          <w:b/>
+          <w:bCs/>
+        </w:rPr>
+        <w:t xml:space="preserve">[COMPANY]</w:t>
+      </w:r>
+      <w:r>
+        <w:t xml:space="preserve"> </w:t>
+      </w:r>
+      <w:r>
+        <w:t xml:space="preserve">decide whether members may connect them,</w:t>
+      </w:r>
+      <w:r>
+        <w:t xml:space="preserve"> </w:t>
+      </w:r>
+      <w:r>
+        <w:t xml:space="preserve">and under which terms (for example, only your organisation’s business plans of those apps).</w:t>
+      </w:r>
+    </w:p>
+    <w:p>
+      <w:pPr>
+        <w:pStyle w:val="BodyText"/>
+      </w:pPr>
+      <w:r>
+        <w:rPr>
+          <w:b/>
+          <w:bCs/>
+        </w:rPr>
         <w:t xml:space="preserve">International transfers.</w:t>
       </w:r>
       <w:r>
@@ -995,7 +1107,25 @@
         <w:t xml:space="preserve"> </w:t>
       </w:r>
       <w:r>
-        <w:t xml:space="preserve">records: 90 days. Candidates’ requests to stop your emails: until your company is deleted.</w:t>
+        <w:t xml:space="preserve">records: 90 days. Assistant conversations: 90 days after the last message, and at once when your</w:t>
+      </w:r>
+      <w:r>
+        <w:t xml:space="preserve"> </w:t>
+      </w:r>
+      <w:r>
+        <w:t xml:space="preserve">company is deleted. AI app connections: until the member disconnects one or deletes their</w:t>
+      </w:r>
+      <w:r>
+        <w:t xml:space="preserve"> </w:t>
+      </w:r>
+      <w:r>
+        <w:t xml:space="preserve">account, and 90 days after its last use. Candidates’ requests to stop your emails: until your</w:t>
+      </w:r>
+      <w:r>
+        <w:t xml:space="preserve"> </w:t>
+      </w:r>
+      <w:r>
+        <w:t xml:space="preserve">company is deleted.</w:t>
       </w:r>
       <w:r>
         <w:t xml:space="preserve"> </w:t>
@@ -1696,6 +1826,92 @@
               <w:pStyle w:val="Compact"/>
             </w:pPr>
             <w:r>
+              <w:t xml:space="preserve">Over-reliance on the assistant’s summaries or comparisons</w:t>
+            </w:r>
+          </w:p>
+        </w:tc>
+        <w:tc>
+          <w:tcPr/>
+          <w:p>
+            <w:pPr>
+              <w:pStyle w:val="Compact"/>
+            </w:pPr>
+            <w:r>
+              <w:t xml:space="preserve">AI-written answers about candidates</w:t>
+            </w:r>
+          </w:p>
+        </w:tc>
+        <w:tc>
+          <w:tcPr/>
+          <w:p>
+            <w:pPr>
+              <w:pStyle w:val="Compact"/>
+            </w:pPr>
+            <w:r>
+              <w:t xml:space="preserve">It answers only from the data its tools read, says the AI can be wrong, makes no decision, and asks before every action in the app; audit log marks results read through it</w:t>
+            </w:r>
+          </w:p>
+        </w:tc>
+        <w:tc>
+          <w:tcPr/>
+          <w:p>
+            <w:pPr>
+              <w:pStyle w:val="Compact"/>
+            </w:pPr>
+          </w:p>
+        </w:tc>
+      </w:tr>
+      <w:tr>
+        <w:tc>
+          <w:tcPr/>
+          <w:p>
+            <w:pPr>
+              <w:pStyle w:val="Compact"/>
+            </w:pPr>
+            <w:r>
+              <w:t xml:space="preserve">Candidates’ data in an AI app outside your control</w:t>
+            </w:r>
+          </w:p>
+        </w:tc>
+        <w:tc>
+          <w:tcPr/>
+          <w:p>
+            <w:pPr>
+              <w:pStyle w:val="Compact"/>
+            </w:pPr>
+            <w:r>
+              <w:t xml:space="preserve">A member connecting Claude, ChatGPT or another app</w:t>
+            </w:r>
+          </w:p>
+        </w:tc>
+        <w:tc>
+          <w:tcPr/>
+          <w:p>
+            <w:pPr>
+              <w:pStyle w:val="Compact"/>
+            </w:pPr>
+            <w:r>
+              <w:t xml:space="preserve">Only the member’s own access; deleting an account or a company is impossible through an app; connections end when disconnected or unused for 90 days</w:t>
+            </w:r>
+          </w:p>
+        </w:tc>
+        <w:tc>
+          <w:tcPr/>
+          <w:p>
+            <w:pPr>
+              <w:pStyle w:val="Compact"/>
+            </w:pPr>
+          </w:p>
+        </w:tc>
+      </w:tr>
+      <w:tr>
+        <w:tc>
+          <w:tcPr/>
+          <w:p>
+            <w:pPr>
+              <w:pStyle w:val="Compact"/>
+            </w:pPr>
+            <w:r>
               <w:t xml:space="preserve">Lack of transparency</w:t>
             </w:r>
           </w:p>
@@ -1949,6 +2165,18 @@
         <w:numPr>
           <w:ilvl w:val="0"/>
           <w:numId w:val="1012"/>
+        </w:numPr>
+      </w:pPr>
+      <w:r>
+        <w:t xml:space="preserve">Decided whether members may use the assistant and connect AI apps, and under which terms</w:t>
+      </w:r>
+    </w:p>
+    <w:p>
+      <w:pPr>
+        <w:pStyle w:val="Compact"/>
+        <w:numPr>
+          <w:ilvl w:val="0"/>
+          <w:numId w:val="1013"/>
         </w:numPr>
       </w:pPr>
       <w:r>
@@ -2622,6 +2850,9 @@
     <w:abstractNumId w:val="992"/>
   </w:num>
   <w:num w:numId="1012">
+    <w:abstractNumId w:val="992"/>
+  </w:num>
+  <w:num w:numId="1013">
     <w:abstractNumId w:val="992"/>
   </w:num>
 </w:numbering>

</xml_diff>

<commit_message>
Legal documents: the terms, privacy policy and DPA in all 23 languages, each page saying it's a translation and linking the binding English; Upstash is no longer a sub-processor
Co-Authored-By: Claude Opus 5.5 <noreply@anthropic.com>
</commit_message>
<xml_diff>
--- a/frontend/public/documents/prepza-dpia-template.docx
+++ b/frontend/public/documents/prepza-dpia-template.docx
@@ -945,18 +945,6 @@
       </w:pPr>
       <w:r>
         <w:t xml:space="preserve">Sentry (error reports, without email addresses; EU).</w:t>
-      </w:r>
-    </w:p>
-    <w:p>
-      <w:pPr>
-        <w:pStyle w:val="Compact"/>
-        <w:numPr>
-          <w:ilvl w:val="0"/>
-          <w:numId w:val="1002"/>
-        </w:numPr>
-      </w:pPr>
-      <w:r>
-        <w:t xml:space="preserve">Upstash (short-lived counters for limits and live updates; EU, Belgium).</w:t>
       </w:r>
     </w:p>
     <w:p>

</xml_diff>

<commit_message>
Legal documents: Upstash is a sub-processor again (Redis stays on it), in English and every translation
Co-Authored-By: Claude Opus 5.5 <noreply@anthropic.com>
</commit_message>
<xml_diff>
--- a/frontend/public/documents/prepza-dpia-template.docx
+++ b/frontend/public/documents/prepza-dpia-template.docx
@@ -945,6 +945,18 @@
       </w:pPr>
       <w:r>
         <w:t xml:space="preserve">Sentry (error reports, without email addresses; EU).</w:t>
+      </w:r>
+    </w:p>
+    <w:p>
+      <w:pPr>
+        <w:pStyle w:val="Compact"/>
+        <w:numPr>
+          <w:ilvl w:val="0"/>
+          <w:numId w:val="1002"/>
+        </w:numPr>
+      </w:pPr>
+      <w:r>
+        <w:t xml:space="preserve">Upstash (short-lived counters for limits and live updates; EU, Belgium).</w:t>
       </w:r>
     </w:p>
     <w:p>

</xml_diff>

<commit_message>
Legal: the privacy policy and the DPA's 2026-10-29 versions name Cloudflare, which runs the "I'm not a robot" check (for candidates a sub-processor, announced 14 days ahead), in every language; the downloadable DPA and the impact assessment template say the same
Co-Authored-By: Claude Opus 5.5 <noreply@anthropic.com>
</commit_message>
<xml_diff>
--- a/frontend/public/documents/prepza-dpia-template.docx
+++ b/frontend/public/documents/prepza-dpia-template.docx
@@ -16,7 +16,7 @@
         <w:pStyle w:val="FirstParagraph"/>
       </w:pPr>
       <w:r>
-        <w:t xml:space="preserve">Version: 2026-10-14</w:t>
+        <w:t xml:space="preserve">Version: 2026-10-29</w:t>
       </w:r>
       <w:r>
         <w:br/>
@@ -945,6 +945,30 @@
       </w:pPr>
       <w:r>
         <w:t xml:space="preserve">Sentry (error reports, without email addresses; EU).</w:t>
+      </w:r>
+    </w:p>
+    <w:p>
+      <w:pPr>
+        <w:pStyle w:val="Compact"/>
+        <w:numPr>
+          <w:ilvl w:val="0"/>
+          <w:numId w:val="1002"/>
+        </w:numPr>
+      </w:pPr>
+      <w:r>
+        <w:t xml:space="preserve">Cloudflare (the</w:t>
+      </w:r>
+      <w:r>
+        <w:t xml:space="preserve"> </w:t>
+      </w:r>
+      <w:r>
+        <w:t xml:space="preserve">“I’m not a robot”</w:t>
+      </w:r>
+      <w:r>
+        <w:t xml:space="preserve"> </w:t>
+      </w:r>
+      <w:r>
+        <w:t xml:space="preserve">check, Turnstile, when a candidate starts through a job ad’s link: their browser’s signals and address, from which prepza keeps only whether it passed; Cloudflare, Inc., United States, under the EU-US Data Privacy Framework).</w:t>
       </w:r>
     </w:p>
     <w:p>

</xml_diff>